<commit_message>
Research on voice acting. Character design is added in the document
</commit_message>
<xml_diff>
--- a/Detail_Doc.docx
+++ b/Detail_Doc.docx
@@ -36,7 +36,7 @@
                     <pic:cNvPicPr preferRelativeResize="0"/>
                   </pic:nvPicPr>
                   <pic:blipFill>
-                    <a:blip r:embed="rId8"/>
+                    <a:blip r:embed="rId9"/>
                     <a:srcRect/>
                     <a:stretch>
                       <a:fillRect/>
@@ -88,7 +88,7 @@
                     <pic:cNvPicPr preferRelativeResize="0"/>
                   </pic:nvPicPr>
                   <pic:blipFill>
-                    <a:blip r:embed="rId9"/>
+                    <a:blip r:embed="rId10"/>
                     <a:srcRect/>
                     <a:stretch>
                       <a:fillRect/>
@@ -674,7 +674,185 @@
       </w:r>
     </w:p>
     <w:p>
-      <w:r>
+      <w:pPr>
+        <w:pStyle w:val="Heading3"/>
+      </w:pPr>
+      <w:r>
+        <w:t xml:space="preserve">Voice Acting </w:t>
+      </w:r>
+    </w:p>
+    <w:p>
+      <w:pPr>
+        <w:jc w:val="both"/>
+      </w:pPr>
+      <w:r>
+        <w:t xml:space="preserve">Voice acting is </w:t>
+      </w:r>
+      <w:r>
+        <w:t>the process that</w:t>
+      </w:r>
+      <w:r>
+        <w:t xml:space="preserve"> </w:t>
+      </w:r>
+      <w:r>
+        <w:t xml:space="preserve">gives life </w:t>
+      </w:r>
+      <w:r>
+        <w:t xml:space="preserve">and personality </w:t>
+      </w:r>
+      <w:r>
+        <w:t xml:space="preserve">to the character through one’s voice. </w:t>
+      </w:r>
+      <w:r>
+        <w:t xml:space="preserve">To do voice acting it is important to understand the characters story, emotion and the character development throughout the story. </w:t>
+      </w:r>
+      <w:r>
+        <w:t>For the animation video, voice actors give distinct voice and personalities to the character</w:t>
+      </w:r>
+      <w:r>
+        <w:t xml:space="preserve"> </w:t>
+      </w:r>
+      <w:sdt>
+        <w:sdtPr>
+          <w:id w:val="-469053133"/>
+          <w:citation/>
+        </w:sdtPr>
+        <w:sdtContent>
+          <w:r>
+            <w:fldChar w:fldCharType="begin"/>
+          </w:r>
+          <w:r>
+            <w:rPr>
+              <w:lang w:val="en-US"/>
+            </w:rPr>
+            <w:instrText xml:space="preserve"> CITATION CHA24 \l 1033 </w:instrText>
+          </w:r>
+          <w:r>
+            <w:fldChar w:fldCharType="separate"/>
+          </w:r>
+          <w:r>
+            <w:rPr>
+              <w:noProof/>
+              <w:lang w:val="en-US"/>
+            </w:rPr>
+            <w:t>(SANDLAN, 2024)</w:t>
+          </w:r>
+          <w:r>
+            <w:fldChar w:fldCharType="end"/>
+          </w:r>
+        </w:sdtContent>
+      </w:sdt>
+      <w:r>
+        <w:t xml:space="preserve">. </w:t>
+      </w:r>
+    </w:p>
+    <w:p>
+      <w:pPr>
+        <w:jc w:val="both"/>
+      </w:pPr>
+      <w:r>
+        <w:t>Things to remember during voice acting</w:t>
+      </w:r>
+      <w:r>
+        <w:t>:</w:t>
+      </w:r>
+    </w:p>
+    <w:p>
+      <w:pPr>
+        <w:pStyle w:val="ListParagraph"/>
+        <w:numPr>
+          <w:ilvl w:val="0"/>
+          <w:numId w:val="6"/>
+        </w:numPr>
+        <w:jc w:val="both"/>
+      </w:pPr>
+      <w:r>
+        <w:t>Every word should have clear pronunciation, clearly delivering the message.</w:t>
+      </w:r>
+    </w:p>
+    <w:p>
+      <w:pPr>
+        <w:pStyle w:val="ListParagraph"/>
+        <w:numPr>
+          <w:ilvl w:val="0"/>
+          <w:numId w:val="6"/>
+        </w:numPr>
+        <w:jc w:val="both"/>
+      </w:pPr>
+      <w:r>
+        <w:t>The pace should be maintained according to the requirements</w:t>
+      </w:r>
+      <w:r>
+        <w:t xml:space="preserve"> and the pause should be used effectively</w:t>
+      </w:r>
+      <w:r>
+        <w:t>;</w:t>
+      </w:r>
+      <w:r>
+        <w:t xml:space="preserve"> emphasiz</w:t>
+      </w:r>
+      <w:r>
+        <w:t xml:space="preserve">es </w:t>
+      </w:r>
+      <w:r>
+        <w:t xml:space="preserve">the content. </w:t>
+      </w:r>
+    </w:p>
+    <w:p>
+      <w:pPr>
+        <w:pStyle w:val="ListParagraph"/>
+        <w:numPr>
+          <w:ilvl w:val="0"/>
+          <w:numId w:val="6"/>
+        </w:numPr>
+        <w:jc w:val="both"/>
+      </w:pPr>
+      <w:r>
+        <w:t xml:space="preserve">Acting skill is necessary to bring out the emotion and personalities of the character. </w:t>
+      </w:r>
+    </w:p>
+    <w:p>
+      <w:pPr>
+        <w:pStyle w:val="ListParagraph"/>
+        <w:numPr>
+          <w:ilvl w:val="0"/>
+          <w:numId w:val="6"/>
+        </w:numPr>
+        <w:jc w:val="both"/>
+      </w:pPr>
+      <w:r>
+        <w:t>Understand the in</w:t>
+      </w:r>
+      <w:r>
+        <w:t xml:space="preserve">tonation, rise and fall of the voice. </w:t>
+      </w:r>
+    </w:p>
+    <w:p>
+      <w:pPr>
+        <w:pStyle w:val="ListParagraph"/>
+        <w:numPr>
+          <w:ilvl w:val="0"/>
+          <w:numId w:val="6"/>
+        </w:numPr>
+        <w:jc w:val="both"/>
+      </w:pPr>
+      <w:r>
+        <w:t xml:space="preserve">The tone and style of the voice should be consistent. </w:t>
+      </w:r>
+    </w:p>
+    <w:p>
+      <w:pPr>
+        <w:jc w:val="both"/>
+      </w:pPr>
+    </w:p>
+    <w:p/>
+    <w:p/>
+    <w:p>
+      <w:pPr>
+        <w:pStyle w:val="Heading3"/>
+      </w:pPr>
+      <w:r>
+        <w:lastRenderedPageBreak/>
         <w:br w:type="page"/>
       </w:r>
     </w:p>
@@ -1009,6 +1187,84 @@
     </w:p>
     <w:p>
       <w:pPr>
+        <w:keepNext/>
+        <w:jc w:val="center"/>
+      </w:pPr>
+      <w:r>
+        <w:rPr>
+          <w:noProof/>
+        </w:rPr>
+        <w:drawing>
+          <wp:inline distT="0" distB="0" distL="0" distR="0" wp14:anchorId="58542B08" wp14:editId="2EC272F4">
+            <wp:extent cx="5943600" cy="2128520"/>
+            <wp:effectExtent l="0" t="0" r="0" b="5080"/>
+            <wp:docPr id="724892370" name="Picture 1"/>
+            <wp:cNvGraphicFramePr>
+              <a:graphicFrameLocks xmlns:a="http://schemas.openxmlformats.org/drawingml/2006/main" noChangeAspect="1"/>
+            </wp:cNvGraphicFramePr>
+            <a:graphic xmlns:a="http://schemas.openxmlformats.org/drawingml/2006/main">
+              <a:graphicData uri="http://schemas.openxmlformats.org/drawingml/2006/picture">
+                <pic:pic xmlns:pic="http://schemas.openxmlformats.org/drawingml/2006/picture">
+                  <pic:nvPicPr>
+                    <pic:cNvPr id="724892370" name="Picture 724892370"/>
+                    <pic:cNvPicPr/>
+                  </pic:nvPicPr>
+                  <pic:blipFill>
+                    <a:blip r:embed="rId11" cstate="print">
+                      <a:extLst>
+                        <a:ext uri="{28A0092B-C50C-407E-A947-70E740481C1C}">
+                          <a14:useLocalDpi xmlns:a14="http://schemas.microsoft.com/office/drawing/2010/main" val="0"/>
+                        </a:ext>
+                      </a:extLst>
+                    </a:blip>
+                    <a:stretch>
+                      <a:fillRect/>
+                    </a:stretch>
+                  </pic:blipFill>
+                  <pic:spPr>
+                    <a:xfrm>
+                      <a:off x="0" y="0"/>
+                      <a:ext cx="5943600" cy="2128520"/>
+                    </a:xfrm>
+                    <a:prstGeom prst="rect">
+                      <a:avLst/>
+                    </a:prstGeom>
+                  </pic:spPr>
+                </pic:pic>
+              </a:graphicData>
+            </a:graphic>
+          </wp:inline>
+        </w:drawing>
+      </w:r>
+    </w:p>
+    <w:p>
+      <w:pPr>
+        <w:pStyle w:val="Caption"/>
+        <w:jc w:val="center"/>
+      </w:pPr>
+      <w:r>
+        <w:t xml:space="preserve">Figure </w:t>
+      </w:r>
+      <w:fldSimple w:instr=" SEQ Figure \* ARABIC ">
+        <w:r>
+          <w:rPr>
+            <w:noProof/>
+          </w:rPr>
+          <w:t>1</w:t>
+        </w:r>
+      </w:fldSimple>
+      <w:r>
+        <w:t xml:space="preserve">: Voiceover </w:t>
+      </w:r>
+      <w:r>
+        <w:t>Script</w:t>
+      </w:r>
+      <w:r>
+        <w:t>-Rough</w:t>
+      </w:r>
+    </w:p>
+    <w:p>
+      <w:pPr>
         <w:jc w:val="both"/>
       </w:pPr>
       <w:r>
@@ -1022,6 +1278,11 @@
       <w:r>
         <w:t xml:space="preserve">The voiceover script is finalized. </w:t>
       </w:r>
+    </w:p>
+    <w:p>
+      <w:pPr>
+        <w:jc w:val="both"/>
+      </w:pPr>
     </w:p>
     <w:p>
       <w:r>
@@ -1041,6 +1302,46 @@
         <w:jc w:val="both"/>
       </w:pPr>
     </w:p>
+    <w:p>
+      <w:pPr>
+        <w:pStyle w:val="Heading2"/>
+      </w:pPr>
+      <w:r>
+        <w:lastRenderedPageBreak/>
+        <w:t>Character Design</w:t>
+      </w:r>
+    </w:p>
+    <w:p>
+      <w:pPr>
+        <w:jc w:val="both"/>
+      </w:pPr>
+      <w:r>
+        <w:t>Since in the book uses first person narration, the plastic is the character. So, during the development process there were many ideas to create a character out of pl</w:t>
+      </w:r>
+      <w:r>
+        <w:t>a</w:t>
+      </w:r>
+      <w:r>
+        <w:t>stic bottles, polythene bag but after detail analysis of its pros and cons, t</w:t>
+      </w:r>
+      <w:r>
+        <w:t xml:space="preserve">he best option was to make </w:t>
+      </w:r>
+      <w:r>
+        <w:t xml:space="preserve">a simple character as a plastic mascot. </w:t>
+      </w:r>
+      <w:r>
+        <w:t>If the character was bottle or bag then the children could just think of the bottle as only the plastic throughout the video</w:t>
+      </w:r>
+      <w:r>
+        <w:t>.</w:t>
+      </w:r>
+    </w:p>
+    <w:p>
+      <w:pPr>
+        <w:jc w:val="both"/>
+      </w:pPr>
+    </w:p>
     <w:p/>
     <w:p>
       <w:r>
@@ -1048,7 +1349,7 @@
       </w:r>
     </w:p>
     <w:sectPr>
-      <w:footerReference w:type="default" r:id="rId10"/>
+      <w:footerReference w:type="default" r:id="rId12"/>
       <w:pgSz w:w="12240" w:h="15840"/>
       <w:pgMar w:top="1440" w:right="1440" w:bottom="1440" w:left="1440" w:header="720" w:footer="720" w:gutter="0"/>
       <w:pgNumType w:start="1"/>
@@ -1615,6 +1916,119 @@
     </w:lvl>
   </w:abstractNum>
   <w:abstractNum w:abstractNumId="4" w15:restartNumberingAfterBreak="0">
+    <w:nsid w:val="69A933E7"/>
+    <w:multiLevelType w:val="hybridMultilevel"/>
+    <w:tmpl w:val="BB2878D4"/>
+    <w:lvl w:ilvl="0" w:tplc="04090001">
+      <w:start w:val="1"/>
+      <w:numFmt w:val="bullet"/>
+      <w:lvlText w:val=""/>
+      <w:lvlJc w:val="left"/>
+      <w:pPr>
+        <w:ind w:left="720" w:hanging="360"/>
+      </w:pPr>
+      <w:rPr>
+        <w:rFonts w:ascii="Symbol" w:hAnsi="Symbol" w:hint="default"/>
+      </w:rPr>
+    </w:lvl>
+    <w:lvl w:ilvl="1" w:tplc="04090003" w:tentative="1">
+      <w:start w:val="1"/>
+      <w:numFmt w:val="bullet"/>
+      <w:lvlText w:val="o"/>
+      <w:lvlJc w:val="left"/>
+      <w:pPr>
+        <w:ind w:left="1440" w:hanging="360"/>
+      </w:pPr>
+      <w:rPr>
+        <w:rFonts w:ascii="Courier New" w:hAnsi="Courier New" w:hint="default"/>
+      </w:rPr>
+    </w:lvl>
+    <w:lvl w:ilvl="2" w:tplc="04090005" w:tentative="1">
+      <w:start w:val="1"/>
+      <w:numFmt w:val="bullet"/>
+      <w:lvlText w:val=""/>
+      <w:lvlJc w:val="left"/>
+      <w:pPr>
+        <w:ind w:left="2160" w:hanging="360"/>
+      </w:pPr>
+      <w:rPr>
+        <w:rFonts w:ascii="Wingdings" w:hAnsi="Wingdings" w:hint="default"/>
+      </w:rPr>
+    </w:lvl>
+    <w:lvl w:ilvl="3" w:tplc="04090001" w:tentative="1">
+      <w:start w:val="1"/>
+      <w:numFmt w:val="bullet"/>
+      <w:lvlText w:val=""/>
+      <w:lvlJc w:val="left"/>
+      <w:pPr>
+        <w:ind w:left="2880" w:hanging="360"/>
+      </w:pPr>
+      <w:rPr>
+        <w:rFonts w:ascii="Symbol" w:hAnsi="Symbol" w:hint="default"/>
+      </w:rPr>
+    </w:lvl>
+    <w:lvl w:ilvl="4" w:tplc="04090003" w:tentative="1">
+      <w:start w:val="1"/>
+      <w:numFmt w:val="bullet"/>
+      <w:lvlText w:val="o"/>
+      <w:lvlJc w:val="left"/>
+      <w:pPr>
+        <w:ind w:left="3600" w:hanging="360"/>
+      </w:pPr>
+      <w:rPr>
+        <w:rFonts w:ascii="Courier New" w:hAnsi="Courier New" w:hint="default"/>
+      </w:rPr>
+    </w:lvl>
+    <w:lvl w:ilvl="5" w:tplc="04090005" w:tentative="1">
+      <w:start w:val="1"/>
+      <w:numFmt w:val="bullet"/>
+      <w:lvlText w:val=""/>
+      <w:lvlJc w:val="left"/>
+      <w:pPr>
+        <w:ind w:left="4320" w:hanging="360"/>
+      </w:pPr>
+      <w:rPr>
+        <w:rFonts w:ascii="Wingdings" w:hAnsi="Wingdings" w:hint="default"/>
+      </w:rPr>
+    </w:lvl>
+    <w:lvl w:ilvl="6" w:tplc="04090001" w:tentative="1">
+      <w:start w:val="1"/>
+      <w:numFmt w:val="bullet"/>
+      <w:lvlText w:val=""/>
+      <w:lvlJc w:val="left"/>
+      <w:pPr>
+        <w:ind w:left="5040" w:hanging="360"/>
+      </w:pPr>
+      <w:rPr>
+        <w:rFonts w:ascii="Symbol" w:hAnsi="Symbol" w:hint="default"/>
+      </w:rPr>
+    </w:lvl>
+    <w:lvl w:ilvl="7" w:tplc="04090003" w:tentative="1">
+      <w:start w:val="1"/>
+      <w:numFmt w:val="bullet"/>
+      <w:lvlText w:val="o"/>
+      <w:lvlJc w:val="left"/>
+      <w:pPr>
+        <w:ind w:left="5760" w:hanging="360"/>
+      </w:pPr>
+      <w:rPr>
+        <w:rFonts w:ascii="Courier New" w:hAnsi="Courier New" w:hint="default"/>
+      </w:rPr>
+    </w:lvl>
+    <w:lvl w:ilvl="8" w:tplc="04090005" w:tentative="1">
+      <w:start w:val="1"/>
+      <w:numFmt w:val="bullet"/>
+      <w:lvlText w:val=""/>
+      <w:lvlJc w:val="left"/>
+      <w:pPr>
+        <w:ind w:left="6480" w:hanging="360"/>
+      </w:pPr>
+      <w:rPr>
+        <w:rFonts w:ascii="Wingdings" w:hAnsi="Wingdings" w:hint="default"/>
+      </w:rPr>
+    </w:lvl>
+  </w:abstractNum>
+  <w:abstractNum w:abstractNumId="5" w15:restartNumberingAfterBreak="0">
     <w:nsid w:val="6EA73E0E"/>
     <w:multiLevelType w:val="multilevel"/>
     <w:tmpl w:val="2440EF36"/>
@@ -1735,7 +2149,7 @@
     <w:abstractNumId w:val="1"/>
   </w:num>
   <w:num w:numId="2" w16cid:durableId="1640842900">
-    <w:abstractNumId w:val="4"/>
+    <w:abstractNumId w:val="5"/>
   </w:num>
   <w:num w:numId="3" w16cid:durableId="1836069747">
     <w:abstractNumId w:val="2"/>
@@ -1745,6 +2159,9 @@
   </w:num>
   <w:num w:numId="5" w16cid:durableId="1190753277">
     <w:abstractNumId w:val="0"/>
+  </w:num>
+  <w:num w:numId="6" w16cid:durableId="1713966583">
+    <w:abstractNumId w:val="4"/>
   </w:num>
 </w:numbering>
 </file>
@@ -2765,6 +3182,25 @@
       <w:szCs w:val="48"/>
     </w:rPr>
   </w:style>
+  <w:style w:type="paragraph" w:styleId="Caption">
+    <w:name w:val="caption"/>
+    <w:basedOn w:val="Normal"/>
+    <w:next w:val="Normal"/>
+    <w:uiPriority w:val="35"/>
+    <w:unhideWhenUsed/>
+    <w:qFormat/>
+    <w:rsid w:val="008F4B3F"/>
+    <w:pPr>
+      <w:spacing w:after="200" w:line="240" w:lineRule="auto"/>
+    </w:pPr>
+    <w:rPr>
+      <w:i/>
+      <w:iCs/>
+      <w:color w:val="44546A" w:themeColor="text2"/>
+      <w:sz w:val="18"/>
+      <w:szCs w:val="18"/>
+    </w:rPr>
+  </w:style>
 </w:styles>
 </file>
 
@@ -3030,12 +3466,47 @@
 </file>
 
 <file path=customXml/item1.xml><?xml version="1.0" encoding="utf-8"?>
+<b:Sources xmlns:b="http://schemas.openxmlformats.org/officeDocument/2006/bibliography" xmlns="http://schemas.openxmlformats.org/officeDocument/2006/bibliography" SelectedStyle="/HarvardAnglia2008OfficeOnline.xsl" StyleName="Harvard - Anglia" Version="2008">
+  <b:Source>
+    <b:Tag>CHA24</b:Tag>
+    <b:SourceType>InternetSite</b:SourceType>
+    <b:Guid>{F8780241-A41C-C244-BDE6-88E2B96F66BA}</b:Guid>
+    <b:Author>
+      <b:Author>
+        <b:NameList>
+          <b:Person>
+            <b:Last>SANDLAN</b:Last>
+            <b:First>CHARLIE</b:First>
+          </b:Person>
+        </b:NameList>
+      </b:Author>
+    </b:Author>
+    <b:Title>Maggie Flanigan</b:Title>
+    <b:URL>https://www.maggieflaniganstudio.com/post/how-to-study-voice-acting-a-step-by-step-guide</b:URL>
+    <b:Year>2024</b:Year>
+    <b:YearAccessed>2026</b:YearAccessed>
+    <b:MonthAccessed>2</b:MonthAccessed>
+    <b:DayAccessed>26</b:DayAccessed>
+    <b:RefOrder>1</b:RefOrder>
+  </b:Source>
+</b:Sources>
+</file>
+
+<file path=customXml/item2.xml><?xml version="1.0" encoding="utf-8"?>
 <go:gDocsCustomXmlDataStorage xmlns:go="http://customooxmlschemas.google.com/" xmlns:r="http://schemas.openxmlformats.org/officeDocument/2006/relationships" uri="GoogleDocsCustomDataVersion2">
   <go:docsCustomData xmlns:go="http://customooxmlschemas.google.com/" roundtripDataSignature="AMtx7mjb6HTUZWHa5dbBkWvX9cy5NNwZGQ==">CgMxLjAyCGguZ2pkZ3hzMgloLjMwajB6bGwyCWguMWZvYjl0ZTIJaC4zem55c2g3MgloLjJldDkycDAyCGgudHlqY3d0MgloLjNkeTZ2a20yCWguMXQzaDVzZjIJaC40ZDM0b2c4MgloLjJzOGV5bzEyCWguMTdkcDh2dTIJaC4zcmRjcmpuMgloLjI2aW4xcmcyCGgubG54Yno5MgloLjM1bmt1bjIyCWguMWtzdjR1djgAciExcnVITXFIeEtLYlR3V2VyNXVaOFk3VkZmV183OXhLX0Q=</go:docsCustomData>
 </go:gDocsCustomXmlDataStorage>
 </file>
 
 <file path=customXml/itemProps1.xml><?xml version="1.0" encoding="utf-8"?>
+<ds:datastoreItem xmlns:ds="http://schemas.openxmlformats.org/officeDocument/2006/customXml" ds:itemID="{58010AC8-3488-4D44-897F-55FC336332F6}">
+  <ds:schemaRefs>
+    <ds:schemaRef ds:uri="http://schemas.openxmlformats.org/officeDocument/2006/bibliography"/>
+  </ds:schemaRefs>
+</ds:datastoreItem>
+</file>
+
+<file path=customXml/itemProps2.xml><?xml version="1.0" encoding="utf-8"?>
 <ds:datastoreItem xmlns:ds="http://schemas.openxmlformats.org/officeDocument/2006/customXml" ds:itemID="{11111111-1234-1234-1234-123412341234}">
   <ds:schemaRefs>
     <ds:schemaRef ds:uri="http://customooxmlschemas.google.com/"/>

</xml_diff>